<commit_message>
data entried and image issue solved
</commit_message>
<xml_diff>
--- a/Guideline/API/Products_API_Guideline.docx
+++ b/Guideline/API/Products_API_Guideline.docx
@@ -1151,18 +1151,21 @@
     <w:tbl>
       <w:tblPr>
         <w:tblStyle w:val="TableGrid"/>
-        <w:tblW w:w="0" w:type="auto"/>
+        <w:tblW w:w="8988" w:type="dxa"/>
         <w:tblLook w:val="04A0" w:firstRow="1" w:lastRow="0" w:firstColumn="1" w:lastColumn="0" w:noHBand="0" w:noVBand="1"/>
       </w:tblPr>
       <w:tblGrid>
-        <w:gridCol w:w="2401"/>
-        <w:gridCol w:w="4158"/>
-        <w:gridCol w:w="2297"/>
+        <w:gridCol w:w="2437"/>
+        <w:gridCol w:w="4220"/>
+        <w:gridCol w:w="2331"/>
       </w:tblGrid>
       <w:tr>
+        <w:trPr>
+          <w:trHeight w:val="269"/>
+        </w:trPr>
         <w:tc>
           <w:tcPr>
-            <w:tcW w:w="2401" w:type="dxa"/>
+            <w:tcW w:w="2437" w:type="dxa"/>
           </w:tcPr>
           <w:p>
             <w:r>
@@ -1172,7 +1175,7 @@
         </w:tc>
         <w:tc>
           <w:tcPr>
-            <w:tcW w:w="4158" w:type="dxa"/>
+            <w:tcW w:w="4220" w:type="dxa"/>
           </w:tcPr>
           <w:p>
             <w:r>
@@ -1182,7 +1185,7 @@
         </w:tc>
         <w:tc>
           <w:tcPr>
-            <w:tcW w:w="2297" w:type="dxa"/>
+            <w:tcW w:w="2331" w:type="dxa"/>
           </w:tcPr>
           <w:p>
             <w:r>
@@ -1192,9 +1195,12 @@
         </w:tc>
       </w:tr>
       <w:tr>
+        <w:trPr>
+          <w:trHeight w:val="269"/>
+        </w:trPr>
         <w:tc>
           <w:tcPr>
-            <w:tcW w:w="2401" w:type="dxa"/>
+            <w:tcW w:w="2437" w:type="dxa"/>
           </w:tcPr>
           <w:p>
             <w:r>
@@ -1204,7 +1210,7 @@
         </w:tc>
         <w:tc>
           <w:tcPr>
-            <w:tcW w:w="4158" w:type="dxa"/>
+            <w:tcW w:w="4220" w:type="dxa"/>
           </w:tcPr>
           <w:p>
             <w:r>
@@ -1214,7 +1220,7 @@
         </w:tc>
         <w:tc>
           <w:tcPr>
-            <w:tcW w:w="2297" w:type="dxa"/>
+            <w:tcW w:w="2331" w:type="dxa"/>
           </w:tcPr>
           <w:p>
             <w:r>
@@ -1224,9 +1230,12 @@
         </w:tc>
       </w:tr>
       <w:tr>
+        <w:trPr>
+          <w:trHeight w:val="269"/>
+        </w:trPr>
         <w:tc>
           <w:tcPr>
-            <w:tcW w:w="2401" w:type="dxa"/>
+            <w:tcW w:w="2437" w:type="dxa"/>
           </w:tcPr>
           <w:p>
             <w:pPr>
@@ -1244,7 +1253,7 @@
         </w:tc>
         <w:tc>
           <w:tcPr>
-            <w:tcW w:w="4158" w:type="dxa"/>
+            <w:tcW w:w="4220" w:type="dxa"/>
           </w:tcPr>
           <w:p>
             <w:pPr>
@@ -1262,7 +1271,7 @@
         </w:tc>
         <w:tc>
           <w:tcPr>
-            <w:tcW w:w="2297" w:type="dxa"/>
+            <w:tcW w:w="2331" w:type="dxa"/>
           </w:tcPr>
           <w:p>
             <w:pPr>
@@ -1280,9 +1289,12 @@
         </w:tc>
       </w:tr>
       <w:tr>
+        <w:trPr>
+          <w:trHeight w:val="269"/>
+        </w:trPr>
         <w:tc>
           <w:tcPr>
-            <w:tcW w:w="2401" w:type="dxa"/>
+            <w:tcW w:w="2437" w:type="dxa"/>
           </w:tcPr>
           <w:p>
             <w:r>
@@ -1292,7 +1304,7 @@
         </w:tc>
         <w:tc>
           <w:tcPr>
-            <w:tcW w:w="4158" w:type="dxa"/>
+            <w:tcW w:w="4220" w:type="dxa"/>
           </w:tcPr>
           <w:p>
             <w:r>
@@ -1302,7 +1314,7 @@
         </w:tc>
         <w:tc>
           <w:tcPr>
-            <w:tcW w:w="2297" w:type="dxa"/>
+            <w:tcW w:w="2331" w:type="dxa"/>
           </w:tcPr>
           <w:p>
             <w:r>
@@ -1312,9 +1324,12 @@
         </w:tc>
       </w:tr>
       <w:tr>
+        <w:trPr>
+          <w:trHeight w:val="261"/>
+        </w:trPr>
         <w:tc>
           <w:tcPr>
-            <w:tcW w:w="2401" w:type="dxa"/>
+            <w:tcW w:w="2437" w:type="dxa"/>
           </w:tcPr>
           <w:p>
             <w:pPr>
@@ -1332,7 +1347,7 @@
         </w:tc>
         <w:tc>
           <w:tcPr>
-            <w:tcW w:w="4158" w:type="dxa"/>
+            <w:tcW w:w="4220" w:type="dxa"/>
           </w:tcPr>
           <w:p>
             <w:pPr>
@@ -1350,7 +1365,7 @@
         </w:tc>
         <w:tc>
           <w:tcPr>
-            <w:tcW w:w="2297" w:type="dxa"/>
+            <w:tcW w:w="2331" w:type="dxa"/>
           </w:tcPr>
           <w:p>
             <w:pPr>
@@ -1368,9 +1383,12 @@
         </w:tc>
       </w:tr>
       <w:tr>
+        <w:trPr>
+          <w:trHeight w:val="269"/>
+        </w:trPr>
         <w:tc>
           <w:tcPr>
-            <w:tcW w:w="2401" w:type="dxa"/>
+            <w:tcW w:w="2437" w:type="dxa"/>
           </w:tcPr>
           <w:p>
             <w:r>
@@ -1380,7 +1398,7 @@
         </w:tc>
         <w:tc>
           <w:tcPr>
-            <w:tcW w:w="4158" w:type="dxa"/>
+            <w:tcW w:w="4220" w:type="dxa"/>
           </w:tcPr>
           <w:p>
             <w:r>
@@ -1390,7 +1408,7 @@
         </w:tc>
         <w:tc>
           <w:tcPr>
-            <w:tcW w:w="2297" w:type="dxa"/>
+            <w:tcW w:w="2331" w:type="dxa"/>
           </w:tcPr>
           <w:p>
             <w:r>
@@ -1400,9 +1418,12 @@
         </w:tc>
       </w:tr>
       <w:tr>
+        <w:trPr>
+          <w:trHeight w:val="269"/>
+        </w:trPr>
         <w:tc>
           <w:tcPr>
-            <w:tcW w:w="2401" w:type="dxa"/>
+            <w:tcW w:w="2437" w:type="dxa"/>
           </w:tcPr>
           <w:p>
             <w:pPr>
@@ -1420,7 +1441,7 @@
         </w:tc>
         <w:tc>
           <w:tcPr>
-            <w:tcW w:w="4158" w:type="dxa"/>
+            <w:tcW w:w="4220" w:type="dxa"/>
           </w:tcPr>
           <w:p>
             <w:pPr>
@@ -1438,7 +1459,7 @@
         </w:tc>
         <w:tc>
           <w:tcPr>
-            <w:tcW w:w="2297" w:type="dxa"/>
+            <w:tcW w:w="2331" w:type="dxa"/>
           </w:tcPr>
           <w:p>
             <w:pPr>
@@ -1456,9 +1477,12 @@
         </w:tc>
       </w:tr>
       <w:tr>
+        <w:trPr>
+          <w:trHeight w:val="269"/>
+        </w:trPr>
         <w:tc>
           <w:tcPr>
-            <w:tcW w:w="2401" w:type="dxa"/>
+            <w:tcW w:w="2437" w:type="dxa"/>
           </w:tcPr>
           <w:p>
             <w:r>
@@ -1468,7 +1492,7 @@
         </w:tc>
         <w:tc>
           <w:tcPr>
-            <w:tcW w:w="4158" w:type="dxa"/>
+            <w:tcW w:w="4220" w:type="dxa"/>
           </w:tcPr>
           <w:p>
             <w:r>
@@ -1478,7 +1502,7 @@
         </w:tc>
         <w:tc>
           <w:tcPr>
-            <w:tcW w:w="2297" w:type="dxa"/>
+            <w:tcW w:w="2331" w:type="dxa"/>
           </w:tcPr>
           <w:p>
             <w:r>
@@ -1488,9 +1512,12 @@
         </w:tc>
       </w:tr>
       <w:tr>
+        <w:trPr>
+          <w:trHeight w:val="261"/>
+        </w:trPr>
         <w:tc>
           <w:tcPr>
-            <w:tcW w:w="2401" w:type="dxa"/>
+            <w:tcW w:w="2437" w:type="dxa"/>
           </w:tcPr>
           <w:p>
             <w:r>
@@ -1500,7 +1527,7 @@
         </w:tc>
         <w:tc>
           <w:tcPr>
-            <w:tcW w:w="4158" w:type="dxa"/>
+            <w:tcW w:w="4220" w:type="dxa"/>
           </w:tcPr>
           <w:p>
             <w:r>
@@ -1510,19 +1537,59 @@
         </w:tc>
         <w:tc>
           <w:tcPr>
-            <w:tcW w:w="2297" w:type="dxa"/>
+            <w:tcW w:w="2331" w:type="dxa"/>
           </w:tcPr>
           <w:p>
             <w:r>
               <w:t>A-Z</w:t>
+            </w:r>
+          </w:p>
+        </w:tc>
+        <w:bookmarkStart w:id="0" w:name="_GoBack"/>
+        <w:bookmarkEnd w:id="0"/>
+      </w:tr>
+      <w:tr>
+        <w:trPr>
+          <w:trHeight w:val="269"/>
+        </w:trPr>
+        <w:tc>
+          <w:tcPr>
+            <w:tcW w:w="2437" w:type="dxa"/>
+          </w:tcPr>
+          <w:p>
+            <w:r>
+              <w:t>GET</w:t>
+            </w:r>
+          </w:p>
+        </w:tc>
+        <w:tc>
+          <w:tcPr>
+            <w:tcW w:w="4220" w:type="dxa"/>
+          </w:tcPr>
+          <w:p>
+            <w:r>
+              <w:t>/products/?ordering=-name</w:t>
+            </w:r>
+          </w:p>
+        </w:tc>
+        <w:tc>
+          <w:tcPr>
+            <w:tcW w:w="2331" w:type="dxa"/>
+          </w:tcPr>
+          <w:p>
+            <w:r>
+              <w:t>Z-A</w:t>
             </w:r>
           </w:p>
         </w:tc>
       </w:tr>
       <w:tr>
+        <w:trPr>
+          <w:trHeight w:val="269"/>
+        </w:trPr>
         <w:tc>
           <w:tcPr>
-            <w:tcW w:w="2401" w:type="dxa"/>
+            <w:tcW w:w="2437" w:type="dxa"/>
           </w:tcPr>
           <w:p>
             <w:r>
@@ -1532,61 +1599,32 @@
         </w:tc>
         <w:tc>
           <w:tcPr>
-            <w:tcW w:w="4158" w:type="dxa"/>
+            <w:tcW w:w="4220" w:type="dxa"/>
           </w:tcPr>
           <w:p>
             <w:r>
-              <w:t>/products/?ordering=-name</w:t>
+              <w:t>/products/?ordering=-created_at</w:t>
             </w:r>
           </w:p>
         </w:tc>
         <w:tc>
           <w:tcPr>
-            <w:tcW w:w="2297" w:type="dxa"/>
+            <w:tcW w:w="2331" w:type="dxa"/>
           </w:tcPr>
           <w:p>
             <w:r>
-              <w:t>Z-A</w:t>
+              <w:t>Newest</w:t>
             </w:r>
           </w:p>
         </w:tc>
       </w:tr>
       <w:tr>
+        <w:trPr>
+          <w:trHeight w:val="269"/>
+        </w:trPr>
         <w:tc>
           <w:tcPr>
-            <w:tcW w:w="2401" w:type="dxa"/>
-          </w:tcPr>
-          <w:p>
-            <w:r>
-              <w:t>GET</w:t>
-            </w:r>
-          </w:p>
-        </w:tc>
-        <w:tc>
-          <w:tcPr>
-            <w:tcW w:w="4158" w:type="dxa"/>
-          </w:tcPr>
-          <w:p>
-            <w:r>
-              <w:t>/products/?ordering=-created_at</w:t>
-            </w:r>
-          </w:p>
-        </w:tc>
-        <w:tc>
-          <w:tcPr>
-            <w:tcW w:w="2297" w:type="dxa"/>
-          </w:tcPr>
-          <w:p>
-            <w:r>
-              <w:t>Newest</w:t>
-            </w:r>
-          </w:p>
-        </w:tc>
-      </w:tr>
-      <w:tr>
-        <w:tc>
-          <w:tcPr>
-            <w:tcW w:w="2401" w:type="dxa"/>
+            <w:tcW w:w="2437" w:type="dxa"/>
           </w:tcPr>
           <w:p>
             <w:pPr>
@@ -1604,7 +1642,7 @@
         </w:tc>
         <w:tc>
           <w:tcPr>
-            <w:tcW w:w="4158" w:type="dxa"/>
+            <w:tcW w:w="4220" w:type="dxa"/>
           </w:tcPr>
           <w:p>
             <w:pPr>
@@ -1622,7 +1660,7 @@
         </w:tc>
         <w:tc>
           <w:tcPr>
-            <w:tcW w:w="2297" w:type="dxa"/>
+            <w:tcW w:w="2331" w:type="dxa"/>
           </w:tcPr>
           <w:p>
             <w:r>
@@ -1638,9 +1676,12 @@
         </w:tc>
       </w:tr>
       <w:tr>
+        <w:trPr>
+          <w:trHeight w:val="269"/>
+        </w:trPr>
         <w:tc>
           <w:tcPr>
-            <w:tcW w:w="2401" w:type="dxa"/>
+            <w:tcW w:w="2437" w:type="dxa"/>
           </w:tcPr>
           <w:p>
             <w:pPr>
@@ -1658,7 +1699,7 @@
         </w:tc>
         <w:tc>
           <w:tcPr>
-            <w:tcW w:w="4158" w:type="dxa"/>
+            <w:tcW w:w="4220" w:type="dxa"/>
           </w:tcPr>
           <w:p>
             <w:pPr>
@@ -1676,7 +1717,7 @@
         </w:tc>
         <w:tc>
           <w:tcPr>
-            <w:tcW w:w="2297" w:type="dxa"/>
+            <w:tcW w:w="2331" w:type="dxa"/>
           </w:tcPr>
           <w:p>
             <w:pPr>
@@ -1694,9 +1735,12 @@
         </w:tc>
       </w:tr>
       <w:tr>
+        <w:trPr>
+          <w:trHeight w:val="530"/>
+        </w:trPr>
         <w:tc>
           <w:tcPr>
-            <w:tcW w:w="2401" w:type="dxa"/>
+            <w:tcW w:w="2437" w:type="dxa"/>
           </w:tcPr>
           <w:p>
             <w:pPr>
@@ -1714,7 +1758,7 @@
         </w:tc>
         <w:tc>
           <w:tcPr>
-            <w:tcW w:w="4158" w:type="dxa"/>
+            <w:tcW w:w="4220" w:type="dxa"/>
           </w:tcPr>
           <w:p>
             <w:pPr>
@@ -1732,7 +1776,7 @@
         </w:tc>
         <w:tc>
           <w:tcPr>
-            <w:tcW w:w="2297" w:type="dxa"/>
+            <w:tcW w:w="2331" w:type="dxa"/>
           </w:tcPr>
           <w:p>
             <w:pPr>
@@ -1750,9 +1794,12 @@
         </w:tc>
       </w:tr>
       <w:tr>
+        <w:trPr>
+          <w:trHeight w:val="530"/>
+        </w:trPr>
         <w:tc>
           <w:tcPr>
-            <w:tcW w:w="2401" w:type="dxa"/>
+            <w:tcW w:w="2437" w:type="dxa"/>
           </w:tcPr>
           <w:p>
             <w:pPr>
@@ -1770,7 +1817,7 @@
         </w:tc>
         <w:tc>
           <w:tcPr>
-            <w:tcW w:w="4158" w:type="dxa"/>
+            <w:tcW w:w="4220" w:type="dxa"/>
           </w:tcPr>
           <w:p>
             <w:pPr>
@@ -1788,7 +1835,7 @@
         </w:tc>
         <w:tc>
           <w:tcPr>
-            <w:tcW w:w="2297" w:type="dxa"/>
+            <w:tcW w:w="2331" w:type="dxa"/>
           </w:tcPr>
           <w:p>
             <w:pPr>
@@ -1806,9 +1853,12 @@
         </w:tc>
       </w:tr>
       <w:tr>
+        <w:trPr>
+          <w:trHeight w:val="799"/>
+        </w:trPr>
         <w:tc>
           <w:tcPr>
-            <w:tcW w:w="2401" w:type="dxa"/>
+            <w:tcW w:w="2437" w:type="dxa"/>
           </w:tcPr>
           <w:p>
             <w:pPr>
@@ -1826,7 +1876,7 @@
         </w:tc>
         <w:tc>
           <w:tcPr>
-            <w:tcW w:w="4158" w:type="dxa"/>
+            <w:tcW w:w="4220" w:type="dxa"/>
           </w:tcPr>
           <w:p>
             <w:pPr>
@@ -1838,25 +1888,13 @@
               <w:rPr>
                 <w:highlight w:val="cyan"/>
               </w:rPr>
-              <w:t>/products/?</w:t>
-            </w:r>
-            <w:r>
-              <w:rPr>
-                <w:highlight w:val="cyan"/>
-              </w:rPr>
-              <w:t xml:space="preserve">limit=value &amp; </w:t>
-            </w:r>
-            <w:r>
-              <w:rPr>
-                <w:highlight w:val="cyan"/>
-              </w:rPr>
-              <w:t>page=value</w:t>
+              <w:t>/products/?limit=value &amp; page=value</w:t>
             </w:r>
           </w:p>
         </w:tc>
         <w:tc>
           <w:tcPr>
-            <w:tcW w:w="2297" w:type="dxa"/>
+            <w:tcW w:w="2331" w:type="dxa"/>
           </w:tcPr>
           <w:p>
             <w:pPr>
@@ -1868,127 +1906,171 @@
               <w:rPr>
                 <w:highlight w:val="cyan"/>
               </w:rPr>
-              <w:t xml:space="preserve">Number of items per request with </w:t>
-            </w:r>
-            <w:r>
+              <w:t>Number of items per request with Next and previous page</w:t>
+            </w:r>
+          </w:p>
+          <w:p>
+            <w:pPr>
               <w:rPr>
                 <w:highlight w:val="cyan"/>
               </w:rPr>
-              <w:t>Next and previous page</w:t>
-            </w:r>
+            </w:pPr>
           </w:p>
         </w:tc>
       </w:tr>
       <w:tr>
+        <w:trPr>
+          <w:trHeight w:val="799"/>
+        </w:trPr>
         <w:tc>
           <w:tcPr>
-            <w:tcW w:w="2401" w:type="dxa"/>
+            <w:tcW w:w="2437" w:type="dxa"/>
           </w:tcPr>
           <w:p>
-            <w:r>
+            <w:pPr>
+              <w:rPr>
+                <w:highlight w:val="cyan"/>
+              </w:rPr>
+            </w:pPr>
+            <w:r>
+              <w:rPr>
+                <w:highlight w:val="cyan"/>
+              </w:rPr>
               <w:t>GET</w:t>
             </w:r>
           </w:p>
         </w:tc>
         <w:tc>
           <w:tcPr>
-            <w:tcW w:w="4158" w:type="dxa"/>
+            <w:tcW w:w="4220" w:type="dxa"/>
           </w:tcPr>
           <w:p>
-            <w:r>
-              <w:t>/products/{product-slug}/</w:t>
+            <w:pPr>
+              <w:rPr>
+                <w:highlight w:val="cyan"/>
+              </w:rPr>
+            </w:pPr>
+            <w:r>
+              <w:rPr>
+                <w:highlight w:val="cyan"/>
+              </w:rPr>
+              <w:t>/products/?</w:t>
+            </w:r>
+            <w:r>
+              <w:rPr>
+                <w:highlight w:val="cyan"/>
+              </w:rPr>
+              <w:t>Ram=16GB &amp;Rom=256GB</w:t>
             </w:r>
           </w:p>
         </w:tc>
         <w:tc>
           <w:tcPr>
-            <w:tcW w:w="2297" w:type="dxa"/>
+            <w:tcW w:w="2331" w:type="dxa"/>
           </w:tcPr>
           <w:p>
-            <w:r>
-              <w:t>Product details</w:t>
+            <w:pPr>
+              <w:rPr>
+                <w:highlight w:val="cyan"/>
+              </w:rPr>
+            </w:pPr>
+            <w:r>
+              <w:rPr>
+                <w:highlight w:val="cyan"/>
+              </w:rPr>
+              <w:t xml:space="preserve">Filter based on specification </w:t>
             </w:r>
           </w:p>
         </w:tc>
       </w:tr>
       <w:tr>
+        <w:trPr>
+          <w:trHeight w:val="269"/>
+        </w:trPr>
         <w:tc>
           <w:tcPr>
-            <w:tcW w:w="2401" w:type="dxa"/>
+            <w:tcW w:w="2437" w:type="dxa"/>
           </w:tcPr>
           <w:p>
             <w:r>
-              <w:t>POST</w:t>
+              <w:t>GET</w:t>
             </w:r>
           </w:p>
         </w:tc>
         <w:tc>
           <w:tcPr>
-            <w:tcW w:w="4158" w:type="dxa"/>
+            <w:tcW w:w="4220" w:type="dxa"/>
           </w:tcPr>
           <w:p>
             <w:r>
-              <w:t>/products/</w:t>
+              <w:t>/products/{product-slug}/</w:t>
             </w:r>
           </w:p>
         </w:tc>
         <w:tc>
           <w:tcPr>
-            <w:tcW w:w="2297" w:type="dxa"/>
+            <w:tcW w:w="2331" w:type="dxa"/>
           </w:tcPr>
           <w:p>
             <w:r>
-              <w:t>Create product — admin</w:t>
+              <w:t>Product details</w:t>
             </w:r>
           </w:p>
         </w:tc>
       </w:tr>
       <w:tr>
+        <w:trPr>
+          <w:trHeight w:val="530"/>
+        </w:trPr>
         <w:tc>
           <w:tcPr>
-            <w:tcW w:w="2401" w:type="dxa"/>
+            <w:tcW w:w="2437" w:type="dxa"/>
           </w:tcPr>
           <w:p>
             <w:r>
-              <w:t>PUT/PATCH</w:t>
+              <w:t>POST</w:t>
             </w:r>
           </w:p>
         </w:tc>
         <w:tc>
           <w:tcPr>
-            <w:tcW w:w="4158" w:type="dxa"/>
+            <w:tcW w:w="4220" w:type="dxa"/>
           </w:tcPr>
           <w:p>
             <w:r>
-              <w:t>/products/{product-slug}/</w:t>
+              <w:t>/products/</w:t>
             </w:r>
           </w:p>
         </w:tc>
         <w:tc>
           <w:tcPr>
-            <w:tcW w:w="2297" w:type="dxa"/>
+            <w:tcW w:w="2331" w:type="dxa"/>
           </w:tcPr>
           <w:p>
             <w:r>
-              <w:t>Update product — admin</w:t>
+              <w:t>Create product — admin</w:t>
             </w:r>
           </w:p>
         </w:tc>
       </w:tr>
       <w:tr>
+        <w:trPr>
+          <w:trHeight w:val="530"/>
+        </w:trPr>
         <w:tc>
           <w:tcPr>
-            <w:tcW w:w="2401" w:type="dxa"/>
+            <w:tcW w:w="2437" w:type="dxa"/>
           </w:tcPr>
           <w:p>
             <w:r>
-              <w:t>DELETE</w:t>
+              <w:lastRenderedPageBreak/>
+              <w:t>PUT/PATCH</w:t>
             </w:r>
           </w:p>
         </w:tc>
         <w:tc>
           <w:tcPr>
-            <w:tcW w:w="4158" w:type="dxa"/>
+            <w:tcW w:w="4220" w:type="dxa"/>
           </w:tcPr>
           <w:p>
             <w:r>
@@ -1998,7 +2080,42 @@
         </w:tc>
         <w:tc>
           <w:tcPr>
-            <w:tcW w:w="2297" w:type="dxa"/>
+            <w:tcW w:w="2331" w:type="dxa"/>
+          </w:tcPr>
+          <w:p>
+            <w:r>
+              <w:t>Update product — admin</w:t>
+            </w:r>
+          </w:p>
+        </w:tc>
+      </w:tr>
+      <w:tr>
+        <w:trPr>
+          <w:trHeight w:val="538"/>
+        </w:trPr>
+        <w:tc>
+          <w:tcPr>
+            <w:tcW w:w="2437" w:type="dxa"/>
+          </w:tcPr>
+          <w:p>
+            <w:r>
+              <w:t>DELETE</w:t>
+            </w:r>
+          </w:p>
+        </w:tc>
+        <w:tc>
+          <w:tcPr>
+            <w:tcW w:w="4220" w:type="dxa"/>
+          </w:tcPr>
+          <w:p>
+            <w:r>
+              <w:t>/products/{product-slug}/</w:t>
+            </w:r>
+          </w:p>
+        </w:tc>
+        <w:tc>
+          <w:tcPr>
+            <w:tcW w:w="2331" w:type="dxa"/>
           </w:tcPr>
           <w:p>
             <w:r>
@@ -2013,7 +2130,6 @@
         <w:pStyle w:val="Heading2"/>
       </w:pPr>
       <w:r>
-        <w:lastRenderedPageBreak/>
         <w:t>Required POST data</w:t>
       </w:r>
     </w:p>
@@ -2250,8 +2366,6 @@
             </w:r>
           </w:p>
         </w:tc>
-        <w:bookmarkStart w:id="0" w:name="_GoBack"/>
-        <w:bookmarkEnd w:id="0"/>
       </w:tr>
       <w:tr>
         <w:tc>
@@ -2613,6 +2727,7 @@
           </w:tcPr>
           <w:p>
             <w:r>
+              <w:lastRenderedPageBreak/>
               <w:t>DELETE</w:t>
             </w:r>
           </w:p>
@@ -2644,7 +2759,6 @@
         <w:pStyle w:val="Heading2"/>
       </w:pPr>
       <w:r>
-        <w:lastRenderedPageBreak/>
         <w:t>Required POST data</w:t>
       </w:r>
     </w:p>
@@ -3257,6 +3371,7 @@
           </w:tcPr>
           <w:p>
             <w:r>
+              <w:lastRenderedPageBreak/>
               <w:t>GET</w:t>
             </w:r>
           </w:p>
@@ -3341,11 +3456,7 @@
           </w:tcPr>
           <w:p>
             <w:r>
-              <w:t xml:space="preserve">Ask question — </w:t>
-            </w:r>
-            <w:r>
-              <w:lastRenderedPageBreak/>
-              <w:t>authenticated</w:t>
+              <w:t>Ask question — authenticated</w:t>
             </w:r>
           </w:p>
         </w:tc>
@@ -3357,7 +3468,6 @@
           </w:tcPr>
           <w:p>
             <w:r>
-              <w:lastRenderedPageBreak/>
               <w:t>GET</w:t>
             </w:r>
           </w:p>
@@ -4078,12 +4188,12 @@
     </w:p>
     <w:p>
       <w:r>
+        <w:lastRenderedPageBreak/>
         <w:t>3. Create Product using category ID and brand ID.</w:t>
       </w:r>
     </w:p>
     <w:p>
       <w:r>
-        <w:lastRenderedPageBreak/>
         <w:t>4. Create Variant Options (RAM, Storage, Color, etc.).</w:t>
       </w:r>
     </w:p>
@@ -28360,7 +28470,7 @@
 </file>
 
 <file path=customXml/itemProps1.xml><?xml version="1.0" encoding="utf-8"?>
-<ds:datastoreItem xmlns:ds="http://schemas.openxmlformats.org/officeDocument/2006/customXml" ds:itemID="{7B9B1546-9EFB-4BD9-9D7A-9A232328703A}">
+<ds:datastoreItem xmlns:ds="http://schemas.openxmlformats.org/officeDocument/2006/customXml" ds:itemID="{773B93FA-42D2-473D-A947-4541587B2E34}">
   <ds:schemaRefs>
     <ds:schemaRef ds:uri="http://schemas.openxmlformats.org/officeDocument/2006/bibliography"/>
   </ds:schemaRefs>

</xml_diff>